<commit_message>
Kapsam slaytının anlatımını biraz genişlet
Altıncı slaytın konuşma metni tek cümleden ibaretti ve ekrandaki tabloyu
karşılıksız bırakıyordu. İki cümle eklendi: formülasyon ve numune sayısı,
uygulanan standart sayısı, kür koşulu ve uygulama zarfı. Hepsi slayttaki
tablonun içeriği, yani ekranda duran veriyi sesli karşılıyor.

Slayt değişmedi; eklenen cümleler yalnız konuşma metninde. Süre on beş
saniyeden yirmi beş saniyeye çıktı, metnin tamamı on bir dakika on dokuz
saniye, sahnede on iki buçuk dakika civarı.

Co-Authored-By: Claude Opus 5 <noreply@anthropic.com>
Claude-Session: https://claude.ai/code/session_01N92FbpMhSF7GJYZXiJxxP2
</commit_message>
<xml_diff>
--- a/konferans-bildirisi/06-sunum/ICSMMEP26_Konusma_Metni.docx
+++ b/konferans-bildirisi/06-sunum/ICSMMEP26_Konusma_Metni.docx
@@ -204,7 +204,7 @@
                 <w:sz w:val="20"/>
                 <w:szCs w:val="20"/>
               </w:rPr>
-              <w:t xml:space="preserve">11:05</w:t>
+              <w:t xml:space="preserve">11:15</w:t>
             </w:r>
             <w:r>
               <w:rPr>
@@ -325,7 +325,7 @@
                 <w:sz w:val="20"/>
                 <w:szCs w:val="20"/>
               </w:rPr>
-              <w:t xml:space="preserve">≈ 12:20</w:t>
+              <w:t xml:space="preserve">≈ 12:30</w:t>
             </w:r>
           </w:p>
         </w:tc>
@@ -789,21 +789,21 @@
           <w:sz w:val="26"/>
           <w:szCs w:val="26"/>
         </w:rPr>
-        <w:t xml:space="preserve">6 · Scope — 0:15</w:t>
-      </w:r>
-    </w:p>
-    <w:p>
-      <w:pPr>
-        <w:spacing w:after="130" w:before="0" w:line="300"/>
-      </w:pPr>
-      <w:r>
-        <w:rPr>
-          <w:rFonts w:ascii="Calibri" w:cs="Calibri" w:eastAsia="Calibri" w:hAnsi="Calibri"/>
-          <w:color w:val="141414"/>
-          <w:sz w:val="23"/>
-          <w:szCs w:val="23"/>
-        </w:rPr>
-        <w:t xml:space="preserve">The boundaries of the work are set out here, so that nothing said today is read beyond them.</w:t>
+        <w:t xml:space="preserve">6 · Scope — 0:25</w:t>
+      </w:r>
+    </w:p>
+    <w:p>
+      <w:pPr>
+        <w:spacing w:after="130" w:before="0" w:line="300"/>
+      </w:pPr>
+      <w:r>
+        <w:rPr>
+          <w:rFonts w:ascii="Calibri" w:cs="Calibri" w:eastAsia="Calibri" w:hAnsi="Calibri"/>
+          <w:color w:val="141414"/>
+          <w:sz w:val="23"/>
+          <w:szCs w:val="23"/>
+        </w:rPr>
+        <w:t xml:space="preserve">The boundaries of the work are set out here, so that nothing said today is read beyond them. Five formulations were produced, with three specimens each for the mechanical tests, and three published standards were applied. The whole series was cured at ambient conditions in a single laboratory, and the application envelope throughout is non-loadbearing interior surfaces.</w:t>
       </w:r>
     </w:p>
     <w:p>
@@ -2648,21 +2648,21 @@
           <w:sz w:val="23"/>
           <w:szCs w:val="23"/>
         </w:rPr>
-        <w:t xml:space="preserve">Yüksek sesle, kronometreyle oku. Metnin kendisi 11:05; sahnede duraklarla</w:t>
-      </w:r>
-    </w:p>
-    <w:p>
-      <w:pPr>
-        <w:spacing w:after="130" w:before="0" w:line="300"/>
-      </w:pPr>
-      <w:r>
-        <w:rPr>
-          <w:rFonts w:ascii="Calibri" w:cs="Calibri" w:eastAsia="Calibri" w:hAnsi="Calibri"/>
-          <w:color w:val="141414"/>
-          <w:sz w:val="23"/>
-          <w:szCs w:val="23"/>
-        </w:rPr>
-        <w:t xml:space="preserve">12:20 civarı.</w:t>
+        <w:t xml:space="preserve">Yüksek sesle, kronometreyle oku. Metnin kendisi 11:15; sahnede duraklarla</w:t>
+      </w:r>
+    </w:p>
+    <w:p>
+      <w:pPr>
+        <w:spacing w:after="130" w:before="0" w:line="300"/>
+      </w:pPr>
+      <w:r>
+        <w:rPr>
+          <w:rFonts w:ascii="Calibri" w:cs="Calibri" w:eastAsia="Calibri" w:hAnsi="Calibri"/>
+          <w:color w:val="141414"/>
+          <w:sz w:val="23"/>
+          <w:szCs w:val="23"/>
+        </w:rPr>
+        <w:t xml:space="preserve">12:30 civarı.</w:t>
       </w:r>
     </w:p>
     <w:p>

</xml_diff>